<commit_message>
docs: actualiza diario de reflexion con nota sobre cambio de proyecto
</commit_message>
<xml_diff>
--- a/docs/fase1/individuales/MUNZENMAYER_REINHARTD_1.2_APT122_DiarioReflexionFase1.docx
+++ b/docs/fase1/individuales/MUNZENMAYER_REINHARTD_1.2_APT122_DiarioReflexionFase1.docx
@@ -380,75 +380,7 @@
                 <w:sz w:val="24"/>
                 <w:szCs w:val="24"/>
               </w:rPr>
-              <w:t>Desde una perspectiva personal; me fueron muy interesantes y entretenidas las asignaturas de: Inteligencia de negocio, así como las relacionadas con Cloud y gestión de datos e información (</w:t>
-            </w:r>
-            <w:proofErr w:type="spellStart"/>
-            <w:r>
-              <w:rPr>
-                <w:rFonts w:eastAsiaTheme="majorEastAsia"/>
-                <w:b/>
-                <w:bCs/>
-                <w:color w:val="767171" w:themeColor="background2" w:themeShade="80"/>
-                <w:sz w:val="24"/>
-                <w:szCs w:val="24"/>
-              </w:rPr>
-              <w:t>BigData</w:t>
-            </w:r>
-            <w:proofErr w:type="spellEnd"/>
-            <w:r>
-              <w:rPr>
-                <w:rFonts w:eastAsiaTheme="majorEastAsia"/>
-                <w:b/>
-                <w:bCs/>
-                <w:color w:val="767171" w:themeColor="background2" w:themeShade="80"/>
-                <w:sz w:val="24"/>
-                <w:szCs w:val="24"/>
-              </w:rPr>
-              <w:t xml:space="preserve"> y Minería de Datos). Uno de los que más me gustaron para </w:t>
-            </w:r>
-            <w:r>
-              <w:rPr>
-                <w:rFonts w:eastAsiaTheme="majorEastAsia"/>
-                <w:b/>
-                <w:bCs/>
-                <w:color w:val="767171" w:themeColor="background2" w:themeShade="80"/>
-                <w:sz w:val="24"/>
-                <w:szCs w:val="24"/>
-              </w:rPr>
-              <w:t>mí</w:t>
-            </w:r>
-            <w:r>
-              <w:rPr>
-                <w:rFonts w:eastAsiaTheme="majorEastAsia"/>
-                <w:b/>
-                <w:bCs/>
-                <w:color w:val="767171" w:themeColor="background2" w:themeShade="80"/>
-                <w:sz w:val="24"/>
-                <w:szCs w:val="24"/>
-              </w:rPr>
-              <w:t xml:space="preserve">, fue Base de datos, </w:t>
-            </w:r>
-            <w:r>
-              <w:rPr>
-                <w:rFonts w:eastAsiaTheme="majorEastAsia"/>
-                <w:b/>
-                <w:bCs/>
-                <w:color w:val="767171" w:themeColor="background2" w:themeShade="80"/>
-                <w:sz w:val="24"/>
-                <w:szCs w:val="24"/>
-              </w:rPr>
-              <w:t>desde cómo</w:t>
-            </w:r>
-            <w:r>
-              <w:rPr>
-                <w:rFonts w:eastAsiaTheme="majorEastAsia"/>
-                <w:b/>
-                <w:bCs/>
-                <w:color w:val="767171" w:themeColor="background2" w:themeShade="80"/>
-                <w:sz w:val="24"/>
-                <w:szCs w:val="24"/>
-              </w:rPr>
-              <w:t xml:space="preserve"> se relacionan y crean, sus tablas, y la lógica en la búsqueda de la información, gestión y manipulación de los datos.</w:t>
+              <w:t>Desde una perspectiva personal; me fueron muy interesantes y entretenidas las asignaturas de: Inteligencia de negocio, así como las relacionadas con Cloud y gestión de datos e información (BigData y Minería de Datos). Uno de los que más me gustaron para mí, fue Base de datos, desde cómo se relacionan y crean, sus tablas, y la lógica en la búsqueda de la información, gestión y manipulación de los datos.</w:t>
             </w:r>
           </w:p>
           <w:p>
@@ -642,42 +574,6 @@
           <w:sz w:val="24"/>
           <w:szCs w:val="24"/>
           <w:lang w:eastAsia="ja-JP"/>
-        </w:rPr>
-      </w:pPr>
-    </w:p>
-    <w:p>
-      <w:pPr>
-        <w:spacing w:after="0" w:line="360" w:lineRule="auto"/>
-        <w:jc w:val="both"/>
-        <w:rPr>
-          <w:b/>
-          <w:bCs/>
-          <w:sz w:val="24"/>
-          <w:szCs w:val="24"/>
-        </w:rPr>
-      </w:pPr>
-    </w:p>
-    <w:p>
-      <w:pPr>
-        <w:spacing w:after="0" w:line="360" w:lineRule="auto"/>
-        <w:jc w:val="both"/>
-        <w:rPr>
-          <w:b/>
-          <w:bCs/>
-          <w:sz w:val="24"/>
-          <w:szCs w:val="24"/>
-        </w:rPr>
-      </w:pPr>
-    </w:p>
-    <w:p>
-      <w:pPr>
-        <w:spacing w:after="0" w:line="360" w:lineRule="auto"/>
-        <w:jc w:val="both"/>
-        <w:rPr>
-          <w:b/>
-          <w:bCs/>
-          <w:sz w:val="24"/>
-          <w:szCs w:val="24"/>
         </w:rPr>
       </w:pPr>
     </w:p>
@@ -735,6 +631,7 @@
                 <w:sz w:val="24"/>
                 <w:szCs w:val="24"/>
               </w:rPr>
+              <w:lastRenderedPageBreak/>
               <w:t xml:space="preserve">2. Revisa las competencias y unidades de competencias correspondientes a cada asignatura de la malla de tu carrera. Marca en </w:t>
             </w:r>
             <w:r>
@@ -886,6 +783,13 @@
               </w:tabs>
               <w:jc w:val="both"/>
               <w:rPr>
+                <w:rFonts w:ascii="Calibri" w:hAnsi="Calibri"/>
+                <w:b/>
+                <w:bCs/>
+              </w:rPr>
+            </w:pPr>
+            <w:r>
+              <w:rPr>
                 <w:rFonts w:eastAsiaTheme="majorEastAsia"/>
                 <w:b/>
                 <w:bCs/>
@@ -893,167 +797,16 @@
                 <w:sz w:val="24"/>
                 <w:szCs w:val="24"/>
               </w:rPr>
-            </w:pPr>
-            <w:r>
-              <w:rPr>
-                <w:rFonts w:eastAsiaTheme="majorEastAsia"/>
-                <w:b/>
-                <w:bCs/>
-                <w:color w:val="767171" w:themeColor="background2" w:themeShade="80"/>
-                <w:sz w:val="24"/>
-                <w:szCs w:val="24"/>
-              </w:rPr>
-              <w:t xml:space="preserve">Me sentí cómodo en los ramos de gestión y documentación, y complicado, pero a su vez mucho </w:t>
-            </w:r>
-            <w:proofErr w:type="spellStart"/>
-            <w:r>
-              <w:rPr>
-                <w:rFonts w:eastAsiaTheme="majorEastAsia"/>
-                <w:b/>
-                <w:bCs/>
-                <w:color w:val="767171" w:themeColor="background2" w:themeShade="80"/>
-                <w:sz w:val="24"/>
-                <w:szCs w:val="24"/>
-              </w:rPr>
-              <w:t>mas</w:t>
-            </w:r>
-            <w:proofErr w:type="spellEnd"/>
-            <w:r>
-              <w:rPr>
-                <w:rFonts w:eastAsiaTheme="majorEastAsia"/>
-                <w:b/>
-                <w:bCs/>
-                <w:color w:val="767171" w:themeColor="background2" w:themeShade="80"/>
-                <w:sz w:val="24"/>
-                <w:szCs w:val="24"/>
-              </w:rPr>
-              <w:t xml:space="preserve"> interesado, con los ramos relacionados con Base de Datos, en nuestro caso con SQL. No me siento preparado ni confiado en los ramos de Programación, ni preparado en las gestiones enteramente con CLOUD, pero es algo que busco mejorar.</w:t>
+              <w:t>Me sentí cómodo en los ramos de gestión y documentación, y complicado, pero a su vez mucho mas interesado, con los ramos relacionados con Base de Datos, en nuestro caso con SQL. No me siento preparado ni confiado en los ramos de Programación, ni preparado en las gestiones enteramente con CLOUD, pero es algo que busco mejorar.</w:t>
             </w:r>
           </w:p>
           <w:p>
             <w:pPr>
-              <w:tabs>
-                <w:tab w:val="left" w:pos="454"/>
-              </w:tabs>
               <w:jc w:val="both"/>
               <w:rPr>
-                <w:rFonts w:eastAsiaTheme="majorEastAsia"/>
-                <w:color w:val="767171" w:themeColor="background2" w:themeShade="80"/>
-                <w:sz w:val="24"/>
-                <w:szCs w:val="24"/>
-              </w:rPr>
-            </w:pPr>
-          </w:p>
-          <w:p>
-            <w:pPr>
-              <w:tabs>
-                <w:tab w:val="left" w:pos="454"/>
-              </w:tabs>
-              <w:jc w:val="both"/>
-              <w:rPr>
-                <w:rFonts w:eastAsiaTheme="majorEastAsia"/>
-                <w:color w:val="767171" w:themeColor="background2" w:themeShade="80"/>
-                <w:sz w:val="24"/>
-                <w:szCs w:val="24"/>
-              </w:rPr>
-            </w:pPr>
-          </w:p>
-          <w:p>
-            <w:pPr>
-              <w:tabs>
-                <w:tab w:val="left" w:pos="454"/>
-              </w:tabs>
-              <w:jc w:val="both"/>
-              <w:rPr>
-                <w:rFonts w:eastAsiaTheme="majorEastAsia"/>
-                <w:color w:val="767171" w:themeColor="background2" w:themeShade="80"/>
-                <w:sz w:val="24"/>
-                <w:szCs w:val="24"/>
-              </w:rPr>
-            </w:pPr>
-          </w:p>
-          <w:p>
-            <w:pPr>
-              <w:tabs>
-                <w:tab w:val="left" w:pos="454"/>
-              </w:tabs>
-              <w:jc w:val="both"/>
-              <w:rPr>
-                <w:rFonts w:eastAsiaTheme="majorEastAsia"/>
-                <w:color w:val="767171" w:themeColor="background2" w:themeShade="80"/>
-                <w:sz w:val="24"/>
-                <w:szCs w:val="24"/>
-              </w:rPr>
-            </w:pPr>
-          </w:p>
-          <w:p>
-            <w:pPr>
-              <w:tabs>
-                <w:tab w:val="left" w:pos="454"/>
-              </w:tabs>
-              <w:jc w:val="both"/>
-              <w:rPr>
-                <w:rFonts w:eastAsiaTheme="majorEastAsia"/>
-                <w:color w:val="767171" w:themeColor="background2" w:themeShade="80"/>
-                <w:sz w:val="24"/>
-                <w:szCs w:val="24"/>
-              </w:rPr>
-            </w:pPr>
-          </w:p>
-          <w:p>
-            <w:pPr>
-              <w:tabs>
-                <w:tab w:val="left" w:pos="454"/>
-              </w:tabs>
-              <w:jc w:val="both"/>
-              <w:rPr>
-                <w:rFonts w:eastAsiaTheme="majorEastAsia"/>
-                <w:color w:val="767171" w:themeColor="background2" w:themeShade="80"/>
-                <w:sz w:val="24"/>
-                <w:szCs w:val="24"/>
-              </w:rPr>
-            </w:pPr>
-          </w:p>
-          <w:p>
-            <w:pPr>
-              <w:tabs>
-                <w:tab w:val="left" w:pos="454"/>
-              </w:tabs>
-              <w:jc w:val="both"/>
-              <w:rPr>
-                <w:rFonts w:eastAsiaTheme="majorEastAsia"/>
-                <w:color w:val="767171" w:themeColor="background2" w:themeShade="80"/>
-                <w:sz w:val="24"/>
-                <w:szCs w:val="24"/>
-              </w:rPr>
-            </w:pPr>
-          </w:p>
-          <w:p>
-            <w:pPr>
-              <w:tabs>
-                <w:tab w:val="left" w:pos="454"/>
-              </w:tabs>
-              <w:jc w:val="both"/>
-              <w:rPr>
-                <w:rFonts w:eastAsiaTheme="majorEastAsia"/>
-                <w:color w:val="767171" w:themeColor="background2" w:themeShade="80"/>
-                <w:sz w:val="24"/>
-                <w:szCs w:val="24"/>
-              </w:rPr>
-            </w:pPr>
-          </w:p>
-          <w:p>
-            <w:pPr>
-              <w:tabs>
-                <w:tab w:val="left" w:pos="454"/>
-              </w:tabs>
-              <w:ind w:left="171"/>
-              <w:jc w:val="both"/>
-              <w:rPr>
-                <w:rFonts w:eastAsiaTheme="majorEastAsia"/>
-                <w:color w:val="767171" w:themeColor="background2" w:themeShade="80"/>
-                <w:sz w:val="24"/>
-                <w:szCs w:val="24"/>
+                <w:rFonts w:ascii="Calibri" w:hAnsi="Calibri"/>
+                <w:b/>
+                <w:bCs/>
               </w:rPr>
             </w:pPr>
           </w:p>
@@ -1061,77 +814,6 @@
             <w:pPr>
               <w:jc w:val="both"/>
               <w:rPr>
-                <w:rFonts w:eastAsiaTheme="majorEastAsia"/>
-                <w:color w:val="767171" w:themeColor="background2" w:themeShade="80"/>
-                <w:sz w:val="24"/>
-                <w:szCs w:val="24"/>
-              </w:rPr>
-            </w:pPr>
-          </w:p>
-          <w:p>
-            <w:pPr>
-              <w:jc w:val="both"/>
-              <w:rPr>
-                <w:rFonts w:ascii="Calibri" w:hAnsi="Calibri"/>
-                <w:b/>
-                <w:bCs/>
-              </w:rPr>
-            </w:pPr>
-          </w:p>
-          <w:p>
-            <w:pPr>
-              <w:jc w:val="both"/>
-              <w:rPr>
-                <w:rFonts w:ascii="Calibri" w:hAnsi="Calibri"/>
-                <w:b/>
-                <w:bCs/>
-              </w:rPr>
-            </w:pPr>
-          </w:p>
-          <w:p>
-            <w:pPr>
-              <w:jc w:val="both"/>
-              <w:rPr>
-                <w:rFonts w:ascii="Calibri" w:hAnsi="Calibri"/>
-                <w:b/>
-                <w:bCs/>
-              </w:rPr>
-            </w:pPr>
-          </w:p>
-          <w:p>
-            <w:pPr>
-              <w:jc w:val="both"/>
-              <w:rPr>
-                <w:rFonts w:ascii="Calibri" w:hAnsi="Calibri"/>
-                <w:b/>
-                <w:bCs/>
-              </w:rPr>
-            </w:pPr>
-          </w:p>
-          <w:p>
-            <w:pPr>
-              <w:jc w:val="both"/>
-              <w:rPr>
-                <w:rFonts w:ascii="Calibri" w:hAnsi="Calibri"/>
-                <w:b/>
-                <w:bCs/>
-              </w:rPr>
-            </w:pPr>
-          </w:p>
-          <w:p>
-            <w:pPr>
-              <w:jc w:val="both"/>
-              <w:rPr>
-                <w:rFonts w:ascii="Calibri" w:hAnsi="Calibri"/>
-                <w:b/>
-                <w:bCs/>
-              </w:rPr>
-            </w:pPr>
-          </w:p>
-          <w:p>
-            <w:pPr>
-              <w:jc w:val="both"/>
-              <w:rPr>
                 <w:rFonts w:ascii="Calibri" w:hAnsi="Calibri"/>
                 <w:b/>
                 <w:bCs/>
@@ -1141,111 +823,6 @@
           </w:p>
         </w:tc>
       </w:tr>
-    </w:tbl>
-    <w:p>
-      <w:pPr>
-        <w:spacing w:after="0" w:line="360" w:lineRule="auto"/>
-        <w:jc w:val="both"/>
-        <w:rPr>
-          <w:color w:val="595959" w:themeColor="text1" w:themeTint="A6"/>
-          <w:sz w:val="24"/>
-          <w:szCs w:val="24"/>
-          <w:lang w:eastAsia="ja-JP"/>
-        </w:rPr>
-      </w:pPr>
-    </w:p>
-    <w:p/>
-    <w:p/>
-    <w:p/>
-    <w:p>
-      <w:pPr>
-        <w:spacing w:after="0" w:line="360" w:lineRule="auto"/>
-        <w:jc w:val="both"/>
-        <w:rPr>
-          <w:b/>
-          <w:bCs/>
-          <w:sz w:val="24"/>
-          <w:szCs w:val="24"/>
-        </w:rPr>
-      </w:pPr>
-    </w:p>
-    <w:p>
-      <w:pPr>
-        <w:spacing w:after="0" w:line="360" w:lineRule="auto"/>
-        <w:jc w:val="both"/>
-        <w:rPr>
-          <w:b/>
-          <w:bCs/>
-          <w:sz w:val="24"/>
-          <w:szCs w:val="24"/>
-        </w:rPr>
-      </w:pPr>
-    </w:p>
-    <w:p>
-      <w:pPr>
-        <w:spacing w:after="0" w:line="360" w:lineRule="auto"/>
-        <w:jc w:val="both"/>
-        <w:rPr>
-          <w:b/>
-          <w:bCs/>
-          <w:sz w:val="24"/>
-          <w:szCs w:val="24"/>
-        </w:rPr>
-      </w:pPr>
-    </w:p>
-    <w:p>
-      <w:pPr>
-        <w:spacing w:after="0" w:line="360" w:lineRule="auto"/>
-        <w:jc w:val="both"/>
-        <w:rPr>
-          <w:b/>
-          <w:bCs/>
-          <w:sz w:val="24"/>
-          <w:szCs w:val="24"/>
-        </w:rPr>
-      </w:pPr>
-    </w:p>
-    <w:p>
-      <w:pPr>
-        <w:spacing w:after="0" w:line="360" w:lineRule="auto"/>
-        <w:jc w:val="both"/>
-        <w:rPr>
-          <w:b/>
-          <w:bCs/>
-          <w:sz w:val="24"/>
-          <w:szCs w:val="24"/>
-        </w:rPr>
-      </w:pPr>
-    </w:p>
-    <w:p>
-      <w:pPr>
-        <w:spacing w:after="0" w:line="360" w:lineRule="auto"/>
-        <w:jc w:val="both"/>
-        <w:rPr>
-          <w:b/>
-          <w:bCs/>
-          <w:sz w:val="24"/>
-          <w:szCs w:val="24"/>
-        </w:rPr>
-      </w:pPr>
-    </w:p>
-    <w:tbl>
-      <w:tblPr>
-        <w:tblStyle w:val="Tablaconcuadrcula"/>
-        <w:tblW w:w="0" w:type="auto"/>
-        <w:tblBorders>
-          <w:top w:val="single" w:sz="4" w:space="0" w:color="BFBFBF" w:themeColor="background1" w:themeShade="BF"/>
-          <w:left w:val="single" w:sz="4" w:space="0" w:color="BFBFBF" w:themeColor="background1" w:themeShade="BF"/>
-          <w:bottom w:val="single" w:sz="4" w:space="0" w:color="BFBFBF" w:themeColor="background1" w:themeShade="BF"/>
-          <w:right w:val="single" w:sz="4" w:space="0" w:color="BFBFBF" w:themeColor="background1" w:themeShade="BF"/>
-          <w:insideH w:val="single" w:sz="4" w:space="0" w:color="BFBFBF" w:themeColor="background1" w:themeShade="BF"/>
-          <w:insideV w:val="single" w:sz="4" w:space="0" w:color="BFBFBF" w:themeColor="background1" w:themeShade="BF"/>
-        </w:tblBorders>
-        <w:tblLook w:val="04A0" w:firstRow="1" w:lastRow="0" w:firstColumn="1" w:lastColumn="0" w:noHBand="0" w:noVBand="1"/>
-      </w:tblPr>
-      <w:tblGrid>
-        <w:gridCol w:w="10076"/>
-      </w:tblGrid>
       <w:tr>
         <w:trPr>
           <w:trHeight w:val="440"/>
@@ -1500,7 +1077,6 @@
                 <w:szCs w:val="24"/>
               </w:rPr>
             </w:pPr>
-            <w:proofErr w:type="spellStart"/>
             <w:r>
               <w:rPr>
                 <w:rFonts w:eastAsiaTheme="majorEastAsia"/>
@@ -1510,43 +1086,7 @@
                 <w:sz w:val="24"/>
                 <w:szCs w:val="24"/>
               </w:rPr>
-              <w:t>Prompt</w:t>
-            </w:r>
-            <w:proofErr w:type="spellEnd"/>
-            <w:r>
-              <w:rPr>
-                <w:rFonts w:eastAsiaTheme="majorEastAsia"/>
-                <w:b/>
-                <w:bCs/>
-                <w:color w:val="767171" w:themeColor="background2" w:themeShade="80"/>
-                <w:sz w:val="24"/>
-                <w:szCs w:val="24"/>
-              </w:rPr>
-              <w:t xml:space="preserve">, datos, arquitectura </w:t>
-            </w:r>
-            <w:proofErr w:type="spellStart"/>
-            <w:r>
-              <w:rPr>
-                <w:rFonts w:eastAsiaTheme="majorEastAsia"/>
-                <w:b/>
-                <w:bCs/>
-                <w:color w:val="767171" w:themeColor="background2" w:themeShade="80"/>
-                <w:sz w:val="24"/>
-                <w:szCs w:val="24"/>
-              </w:rPr>
-              <w:t>cloud</w:t>
-            </w:r>
-            <w:proofErr w:type="spellEnd"/>
-            <w:r>
-              <w:rPr>
-                <w:rFonts w:eastAsiaTheme="majorEastAsia"/>
-                <w:b/>
-                <w:bCs/>
-                <w:color w:val="767171" w:themeColor="background2" w:themeShade="80"/>
-                <w:sz w:val="24"/>
-                <w:szCs w:val="24"/>
-              </w:rPr>
-              <w:t>, programación Python y manejo de SQL y NoSQL</w:t>
+              <w:t>Prompt, datos, arquitectura cloud, programación Python y manejo de SQL y NoSQL</w:t>
             </w:r>
             <w:r>
               <w:rPr>
@@ -1598,9 +1138,8 @@
                 <w:sz w:val="24"/>
                 <w:szCs w:val="24"/>
               </w:rPr>
-              <w:t xml:space="preserve">Programación y </w:t>
+              <w:t>Programación y cloud primeramente, y en segundo puesto SQL </w:t>
             </w:r>
-            <w:proofErr w:type="spellStart"/>
             <w:r>
               <w:rPr>
                 <w:rFonts w:eastAsiaTheme="majorEastAsia"/>
@@ -1610,44 +1149,8 @@
                 <w:sz w:val="24"/>
                 <w:szCs w:val="24"/>
               </w:rPr>
-              <w:t>cloud</w:t>
-            </w:r>
-            <w:proofErr w:type="spellEnd"/>
-            <w:r>
-              <w:rPr>
-                <w:rFonts w:eastAsiaTheme="majorEastAsia"/>
-                <w:b/>
-                <w:bCs/>
-                <w:color w:val="767171" w:themeColor="background2" w:themeShade="80"/>
-                <w:sz w:val="24"/>
-                <w:szCs w:val="24"/>
-              </w:rPr>
-              <w:t xml:space="preserve"> primeramente, y en segundo puesto </w:t>
-            </w:r>
-            <w:proofErr w:type="gramStart"/>
-            <w:r>
-              <w:rPr>
-                <w:rFonts w:eastAsiaTheme="majorEastAsia"/>
-                <w:b/>
-                <w:bCs/>
-                <w:color w:val="767171" w:themeColor="background2" w:themeShade="80"/>
-                <w:sz w:val="24"/>
-                <w:szCs w:val="24"/>
-              </w:rPr>
-              <w:t>SQL </w:t>
-            </w:r>
-            <w:r>
-              <w:rPr>
-                <w:rFonts w:eastAsiaTheme="majorEastAsia"/>
-                <w:b/>
-                <w:bCs/>
-                <w:color w:val="767171" w:themeColor="background2" w:themeShade="80"/>
-                <w:sz w:val="24"/>
-                <w:szCs w:val="24"/>
-              </w:rPr>
               <w:t>.</w:t>
             </w:r>
-            <w:proofErr w:type="gramEnd"/>
           </w:p>
           <w:p>
             <w:pPr>
@@ -1755,10 +1258,10 @@
               </w:tabs>
               <w:jc w:val="both"/>
               <w:rPr>
-                <w:rFonts w:eastAsiaTheme="majorEastAsia"/>
-                <w:color w:val="767171" w:themeColor="background2" w:themeShade="80"/>
-                <w:sz w:val="24"/>
-                <w:szCs w:val="24"/>
+                <w:rFonts w:ascii="Calibri" w:hAnsi="Calibri"/>
+                <w:b/>
+                <w:bCs/>
+                <w:color w:val="1F4E79" w:themeColor="accent1" w:themeShade="80"/>
               </w:rPr>
             </w:pPr>
             <w:r>
@@ -1770,31 +1273,7 @@
                 <w:sz w:val="24"/>
                 <w:szCs w:val="24"/>
               </w:rPr>
-              <w:t>Trabajando en Cloud, y programando, utilizando IA (</w:t>
-            </w:r>
-            <w:proofErr w:type="spellStart"/>
-            <w:r>
-              <w:rPr>
-                <w:rFonts w:eastAsiaTheme="majorEastAsia"/>
-                <w:b/>
-                <w:bCs/>
-                <w:color w:val="767171" w:themeColor="background2" w:themeShade="80"/>
-                <w:sz w:val="24"/>
-                <w:szCs w:val="24"/>
-              </w:rPr>
-              <w:t>skills</w:t>
-            </w:r>
-            <w:proofErr w:type="spellEnd"/>
-            <w:r>
-              <w:rPr>
-                <w:rFonts w:eastAsiaTheme="majorEastAsia"/>
-                <w:b/>
-                <w:bCs/>
-                <w:color w:val="767171" w:themeColor="background2" w:themeShade="80"/>
-                <w:sz w:val="24"/>
-                <w:szCs w:val="24"/>
-              </w:rPr>
-              <w:t xml:space="preserve"> o agentes) apuntando a la WEB.</w:t>
+              <w:t>Trabajando en Cloud, y programando, utilizando IA (skills o agentes) apuntando a la WEB.</w:t>
             </w:r>
           </w:p>
           <w:p>
@@ -1874,131 +1353,8 @@
               </w:rPr>
             </w:pPr>
           </w:p>
-          <w:p>
-            <w:pPr>
-              <w:jc w:val="both"/>
-              <w:rPr>
-                <w:rFonts w:ascii="Calibri" w:hAnsi="Calibri"/>
-                <w:b/>
-                <w:bCs/>
-                <w:color w:val="1F4E79" w:themeColor="accent1" w:themeShade="80"/>
-              </w:rPr>
-            </w:pPr>
-          </w:p>
-          <w:p>
-            <w:pPr>
-              <w:jc w:val="both"/>
-              <w:rPr>
-                <w:rFonts w:ascii="Calibri" w:hAnsi="Calibri"/>
-                <w:b/>
-                <w:bCs/>
-                <w:color w:val="1F4E79" w:themeColor="accent1" w:themeShade="80"/>
-              </w:rPr>
-            </w:pPr>
-          </w:p>
-          <w:p>
-            <w:pPr>
-              <w:jc w:val="both"/>
-              <w:rPr>
-                <w:rFonts w:ascii="Calibri" w:hAnsi="Calibri"/>
-                <w:b/>
-                <w:bCs/>
-                <w:color w:val="1F4E79" w:themeColor="accent1" w:themeShade="80"/>
-              </w:rPr>
-            </w:pPr>
-          </w:p>
         </w:tc>
       </w:tr>
-    </w:tbl>
-    <w:p>
-      <w:pPr>
-        <w:spacing w:after="0" w:line="360" w:lineRule="auto"/>
-        <w:jc w:val="both"/>
-        <w:rPr>
-          <w:color w:val="595959" w:themeColor="text1" w:themeTint="A6"/>
-          <w:sz w:val="24"/>
-          <w:szCs w:val="24"/>
-          <w:lang w:eastAsia="ja-JP"/>
-        </w:rPr>
-      </w:pPr>
-    </w:p>
-    <w:p>
-      <w:pPr>
-        <w:spacing w:after="0" w:line="360" w:lineRule="auto"/>
-        <w:jc w:val="both"/>
-        <w:rPr>
-          <w:b/>
-          <w:bCs/>
-          <w:sz w:val="24"/>
-          <w:szCs w:val="24"/>
-        </w:rPr>
-      </w:pPr>
-    </w:p>
-    <w:p>
-      <w:pPr>
-        <w:spacing w:after="0" w:line="360" w:lineRule="auto"/>
-        <w:jc w:val="both"/>
-        <w:rPr>
-          <w:b/>
-          <w:bCs/>
-          <w:sz w:val="24"/>
-          <w:szCs w:val="24"/>
-        </w:rPr>
-      </w:pPr>
-    </w:p>
-    <w:p>
-      <w:pPr>
-        <w:spacing w:after="0" w:line="360" w:lineRule="auto"/>
-        <w:jc w:val="both"/>
-        <w:rPr>
-          <w:b/>
-          <w:bCs/>
-          <w:sz w:val="24"/>
-          <w:szCs w:val="24"/>
-        </w:rPr>
-      </w:pPr>
-    </w:p>
-    <w:p>
-      <w:pPr>
-        <w:spacing w:after="0" w:line="360" w:lineRule="auto"/>
-        <w:jc w:val="both"/>
-        <w:rPr>
-          <w:b/>
-          <w:bCs/>
-          <w:sz w:val="24"/>
-          <w:szCs w:val="24"/>
-        </w:rPr>
-      </w:pPr>
-    </w:p>
-    <w:p>
-      <w:pPr>
-        <w:spacing w:after="0" w:line="360" w:lineRule="auto"/>
-        <w:jc w:val="both"/>
-        <w:rPr>
-          <w:b/>
-          <w:bCs/>
-          <w:sz w:val="24"/>
-          <w:szCs w:val="24"/>
-        </w:rPr>
-      </w:pPr>
-    </w:p>
-    <w:tbl>
-      <w:tblPr>
-        <w:tblStyle w:val="Tablaconcuadrcula"/>
-        <w:tblW w:w="0" w:type="auto"/>
-        <w:tblBorders>
-          <w:top w:val="single" w:sz="4" w:space="0" w:color="BFBFBF" w:themeColor="background1" w:themeShade="BF"/>
-          <w:left w:val="single" w:sz="4" w:space="0" w:color="BFBFBF" w:themeColor="background1" w:themeShade="BF"/>
-          <w:bottom w:val="single" w:sz="4" w:space="0" w:color="BFBFBF" w:themeColor="background1" w:themeShade="BF"/>
-          <w:right w:val="single" w:sz="4" w:space="0" w:color="BFBFBF" w:themeColor="background1" w:themeShade="BF"/>
-          <w:insideH w:val="single" w:sz="4" w:space="0" w:color="BFBFBF" w:themeColor="background1" w:themeShade="BF"/>
-          <w:insideV w:val="single" w:sz="4" w:space="0" w:color="BFBFBF" w:themeColor="background1" w:themeShade="BF"/>
-        </w:tblBorders>
-        <w:tblLook w:val="04A0" w:firstRow="1" w:lastRow="0" w:firstColumn="1" w:lastColumn="0" w:noHBand="0" w:noVBand="1"/>
-      </w:tblPr>
-      <w:tblGrid>
-        <w:gridCol w:w="10076"/>
-      </w:tblGrid>
       <w:tr>
         <w:trPr>
           <w:trHeight w:val="440"/>
@@ -2145,16 +1501,7 @@
                 <w:sz w:val="24"/>
                 <w:szCs w:val="24"/>
               </w:rPr>
-              <w:t>nguno</w:t>
-            </w:r>
-            <w:r>
-              <w:rPr>
-                <w:rFonts w:eastAsiaTheme="majorEastAsia"/>
-                <w:color w:val="767171" w:themeColor="background2" w:themeShade="80"/>
-                <w:sz w:val="24"/>
-                <w:szCs w:val="24"/>
-              </w:rPr>
-              <w:t xml:space="preserve"> en realidad</w:t>
+              <w:t>nguno en realidad</w:t>
             </w:r>
             <w:r>
               <w:rPr>
@@ -2298,7 +1645,7 @@
                 <w:sz w:val="24"/>
                 <w:szCs w:val="24"/>
               </w:rPr>
-              <w:t>IA y Cloud</w:t>
+              <w:t>Integración y trabajar con APIs, IA y Cloud</w:t>
             </w:r>
           </w:p>
           <w:p>
@@ -2421,6 +1768,176 @@
                 <w:szCs w:val="24"/>
               </w:rPr>
               <w:t>Desarrollo de ideas descabelladas y originales.</w:t>
+            </w:r>
+          </w:p>
+          <w:p>
+            <w:pPr>
+              <w:tabs>
+                <w:tab w:val="left" w:pos="1021"/>
+              </w:tabs>
+              <w:ind w:left="454"/>
+              <w:jc w:val="both"/>
+              <w:rPr>
+                <w:rFonts w:eastAsiaTheme="majorEastAsia"/>
+                <w:color w:val="767171" w:themeColor="background2" w:themeShade="80"/>
+                <w:sz w:val="24"/>
+                <w:szCs w:val="24"/>
+              </w:rPr>
+            </w:pPr>
+          </w:p>
+          <w:p>
+            <w:pPr>
+              <w:tabs>
+                <w:tab w:val="left" w:pos="1021"/>
+              </w:tabs>
+              <w:ind w:left="454"/>
+              <w:jc w:val="both"/>
+              <w:rPr>
+                <w:rFonts w:eastAsiaTheme="majorEastAsia"/>
+                <w:color w:val="767171" w:themeColor="background2" w:themeShade="80"/>
+                <w:sz w:val="24"/>
+                <w:szCs w:val="24"/>
+              </w:rPr>
+            </w:pPr>
+            <w:r>
+              <w:rPr>
+                <w:rFonts w:eastAsiaTheme="majorEastAsia"/>
+                <w:color w:val="767171" w:themeColor="background2" w:themeShade="80"/>
+                <w:sz w:val="24"/>
+                <w:szCs w:val="24"/>
+              </w:rPr>
+              <w:t>E</w:t>
+            </w:r>
+            <w:r>
+              <w:rPr>
+                <w:rFonts w:eastAsiaTheme="majorEastAsia"/>
+                <w:color w:val="767171" w:themeColor="background2" w:themeShade="80"/>
+                <w:sz w:val="24"/>
+                <w:szCs w:val="24"/>
+              </w:rPr>
+              <w:t xml:space="preserve">l proyecto D-PAY </w:t>
+            </w:r>
+            <w:r>
+              <w:rPr>
+                <w:rFonts w:eastAsiaTheme="majorEastAsia"/>
+                <w:color w:val="767171" w:themeColor="background2" w:themeShade="80"/>
+                <w:sz w:val="24"/>
+                <w:szCs w:val="24"/>
+              </w:rPr>
+              <w:t xml:space="preserve">punta </w:t>
+            </w:r>
+            <w:r>
+              <w:rPr>
+                <w:rFonts w:eastAsiaTheme="majorEastAsia"/>
+                <w:color w:val="767171" w:themeColor="background2" w:themeShade="80"/>
+                <w:sz w:val="24"/>
+                <w:szCs w:val="24"/>
+              </w:rPr>
+              <w:t xml:space="preserve">hacia un sistema de cobro multi-pasarela (integración con Webpay y otros proveedores), en articulación con la empresa Dtemite. </w:t>
+            </w:r>
+          </w:p>
+          <w:p>
+            <w:pPr>
+              <w:tabs>
+                <w:tab w:val="left" w:pos="1021"/>
+              </w:tabs>
+              <w:ind w:left="454"/>
+              <w:jc w:val="both"/>
+              <w:rPr>
+                <w:rFonts w:eastAsiaTheme="majorEastAsia"/>
+                <w:color w:val="767171" w:themeColor="background2" w:themeShade="80"/>
+                <w:sz w:val="24"/>
+                <w:szCs w:val="24"/>
+              </w:rPr>
+            </w:pPr>
+          </w:p>
+          <w:p>
+            <w:pPr>
+              <w:tabs>
+                <w:tab w:val="left" w:pos="1021"/>
+              </w:tabs>
+              <w:ind w:left="454"/>
+              <w:jc w:val="both"/>
+              <w:rPr>
+                <w:rFonts w:eastAsiaTheme="majorEastAsia"/>
+                <w:color w:val="767171" w:themeColor="background2" w:themeShade="80"/>
+                <w:sz w:val="24"/>
+                <w:szCs w:val="24"/>
+              </w:rPr>
+            </w:pPr>
+            <w:r>
+              <w:rPr>
+                <w:rFonts w:eastAsiaTheme="majorEastAsia"/>
+                <w:color w:val="767171" w:themeColor="background2" w:themeShade="80"/>
+                <w:sz w:val="24"/>
+                <w:szCs w:val="24"/>
+              </w:rPr>
+              <w:t xml:space="preserve">Aunque no es un proyecto de IA como planteaba inicialmente, sí conecta con la integración de sistemas, </w:t>
+            </w:r>
+            <w:r>
+              <w:rPr>
+                <w:rFonts w:eastAsiaTheme="majorEastAsia"/>
+                <w:b/>
+                <w:bCs/>
+                <w:color w:val="767171" w:themeColor="background2" w:themeShade="80"/>
+                <w:sz w:val="24"/>
+                <w:szCs w:val="24"/>
+              </w:rPr>
+              <w:t>arquitectura de datos</w:t>
+            </w:r>
+            <w:r>
+              <w:rPr>
+                <w:rFonts w:eastAsiaTheme="majorEastAsia"/>
+                <w:color w:val="767171" w:themeColor="background2" w:themeShade="80"/>
+                <w:sz w:val="24"/>
+                <w:szCs w:val="24"/>
+              </w:rPr>
+              <w:t xml:space="preserve"> y trabajo con APIs externas, y aplicar gestión de proyectos y control de versiones</w:t>
+            </w:r>
+            <w:r>
+              <w:rPr>
+                <w:rFonts w:eastAsiaTheme="majorEastAsia"/>
+                <w:color w:val="767171" w:themeColor="background2" w:themeShade="80"/>
+                <w:sz w:val="24"/>
+                <w:szCs w:val="24"/>
+              </w:rPr>
+              <w:t>,</w:t>
+            </w:r>
+            <w:r>
+              <w:rPr>
+                <w:rFonts w:eastAsiaTheme="majorEastAsia"/>
+                <w:color w:val="767171" w:themeColor="background2" w:themeShade="80"/>
+                <w:sz w:val="24"/>
+                <w:szCs w:val="24"/>
+              </w:rPr>
+              <w:t xml:space="preserve"> que </w:t>
+            </w:r>
+            <w:r>
+              <w:rPr>
+                <w:rFonts w:eastAsiaTheme="majorEastAsia"/>
+                <w:color w:val="767171" w:themeColor="background2" w:themeShade="80"/>
+                <w:sz w:val="24"/>
+                <w:szCs w:val="24"/>
+              </w:rPr>
+              <w:t>son</w:t>
+            </w:r>
+            <w:r>
+              <w:rPr>
+                <w:rFonts w:eastAsiaTheme="majorEastAsia"/>
+                <w:color w:val="767171" w:themeColor="background2" w:themeShade="80"/>
+                <w:sz w:val="24"/>
+                <w:szCs w:val="24"/>
+              </w:rPr>
+              <w:t xml:space="preserve"> débiles en mi autoevaluación</w:t>
+            </w:r>
+            <w:r>
+              <w:rPr>
+                <w:rFonts w:eastAsiaTheme="majorEastAsia"/>
+                <w:color w:val="767171" w:themeColor="background2" w:themeShade="80"/>
+                <w:sz w:val="24"/>
+                <w:szCs w:val="24"/>
+              </w:rPr>
+              <w:t>.</w:t>
             </w:r>
           </w:p>
           <w:p>
@@ -2843,7 +2360,7 @@
             </mc:Choice>
             <mc:Fallback>
               <w:pict>
-                <v:group w14:anchorId="51D00065" id="Grupo 32" o:spid="_x0000_s1026" style="position:absolute;margin-left:0;margin-top:0;width:610.5pt;height:15pt;z-index:251659264;mso-width-percent:1000;mso-position-horizontal:center;mso-position-horizontal-relative:page;mso-position-vertical:center;mso-position-vertical-relative:bottom-margin-area;mso-width-percent:1000" coordorigin=",14970" coordsize="12255,300" o:gfxdata="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">
+                <v:group w14:anchorId="51D00065" id="Grupo 32" o:spid="_x0000_s1026" style="position:absolute;margin-left:0;margin-top:0;width:610.5pt;height:15pt;z-index:251659264;mso-width-percent:1000;mso-position-horizontal:center;mso-position-horizontal-relative:page;mso-position-vertical:center;mso-position-vertical-relative:bottom-margin-area;mso-width-percent:1000" coordorigin=",14970" coordsize="12255,300" o:gfxdata="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">
                   <v:shapetype id="_x0000_t202" coordsize="21600,21600" o:spt="202" path="m,l,21600r21600,l21600,xe">
                     <v:stroke joinstyle="miter"/>
                     <v:path gradientshapeok="t" o:connecttype="rect"/>
@@ -9791,16 +9308,15 @@
 </file>
 
 <file path=customXml/item1.xml><?xml version="1.0" encoding="utf-8"?>
-<b:Sources xmlns:b="http://schemas.openxmlformats.org/officeDocument/2006/bibliography" xmlns="http://schemas.openxmlformats.org/officeDocument/2006/bibliography" SelectedStyle="\APASixthEditionOfficeOnline.xsl" StyleName="APA" Version="6"/>
+<?mso-contentType ?>
+<FormTemplates xmlns="http://schemas.microsoft.com/sharepoint/v3/contenttype/forms">
+  <Display>DocumentLibraryForm</Display>
+  <Edit>DocumentLibraryForm</Edit>
+  <New>DocumentLibraryForm</New>
+</FormTemplates>
 </file>
 
 <file path=customXml/item2.xml><?xml version="1.0" encoding="utf-8"?>
-<p:properties xmlns:p="http://schemas.microsoft.com/office/2006/metadata/properties" xmlns:xsi="http://www.w3.org/2001/XMLSchema-instance" xmlns:pc="http://schemas.microsoft.com/office/infopath/2007/PartnerControls">
-  <documentManagement/>
-</p:properties>
-</file>
-
-<file path=customXml/item3.xml><?xml version="1.0" encoding="utf-8"?>
 <ct:contentTypeSchema xmlns:ct="http://schemas.microsoft.com/office/2006/metadata/contentType" xmlns:ma="http://schemas.microsoft.com/office/2006/metadata/properties/metaAttributes" ct:_="" ma:_="" ma:contentTypeName="Documento" ma:contentTypeID="0x010100E96778489EE7714D8BD12CC105EB918B" ma:contentTypeVersion="2" ma:contentTypeDescription="Crear nuevo documento." ma:contentTypeScope="" ma:versionID="416c5c7ae9b5d54d83875cd3c65194e3">
   <xsd:schema xmlns:xsd="http://www.w3.org/2001/XMLSchema" xmlns:xs="http://www.w3.org/2001/XMLSchema" xmlns:p="http://schemas.microsoft.com/office/2006/metadata/properties" xmlns:ns2="126e8a1c-9ea9-435a-ac89-d06c80d62e30" targetNamespace="http://schemas.microsoft.com/office/2006/metadata/properties" ma:root="true" ma:fieldsID="70a237c842677bd850644f8595079f5e" ns2:_="">
     <xsd:import namespace="126e8a1c-9ea9-435a-ac89-d06c80d62e30"/>
@@ -9932,33 +9448,25 @@
 </ct:contentTypeSchema>
 </file>
 
+<file path=customXml/item3.xml><?xml version="1.0" encoding="utf-8"?>
+<p:properties xmlns:p="http://schemas.microsoft.com/office/2006/metadata/properties" xmlns:xsi="http://www.w3.org/2001/XMLSchema-instance" xmlns:pc="http://schemas.microsoft.com/office/infopath/2007/PartnerControls">
+  <documentManagement/>
+</p:properties>
+</file>
+
 <file path=customXml/item4.xml><?xml version="1.0" encoding="utf-8"?>
-<?mso-contentType ?>
-<FormTemplates xmlns="http://schemas.microsoft.com/sharepoint/v3/contenttype/forms">
-  <Display>DocumentLibraryForm</Display>
-  <Edit>DocumentLibraryForm</Edit>
-  <New>DocumentLibraryForm</New>
-</FormTemplates>
+<b:Sources xmlns:b="http://schemas.openxmlformats.org/officeDocument/2006/bibliography" xmlns="http://schemas.openxmlformats.org/officeDocument/2006/bibliography" SelectedStyle="\APASixthEditionOfficeOnline.xsl" StyleName="APA" Version="6"/>
 </file>
 
 <file path=customXml/itemProps1.xml><?xml version="1.0" encoding="utf-8"?>
-<ds:datastoreItem xmlns:ds="http://schemas.openxmlformats.org/officeDocument/2006/customXml" ds:itemID="{38798A93-35BB-4E36-97F5-7254B21EAFCC}">
+<ds:datastoreItem xmlns:ds="http://schemas.openxmlformats.org/officeDocument/2006/customXml" ds:itemID="{DABAA964-10BA-4DBC-ABF2-CDEAC0FAF7AA}">
   <ds:schemaRefs>
-    <ds:schemaRef ds:uri="http://schemas.openxmlformats.org/officeDocument/2006/bibliography"/>
+    <ds:schemaRef ds:uri="http://schemas.microsoft.com/sharepoint/v3/contenttype/forms"/>
   </ds:schemaRefs>
 </ds:datastoreItem>
 </file>
 
 <file path=customXml/itemProps2.xml><?xml version="1.0" encoding="utf-8"?>
-<ds:datastoreItem xmlns:ds="http://schemas.openxmlformats.org/officeDocument/2006/customXml" ds:itemID="{5F1783E3-BA1C-4CA3-8E32-C9B378BBED03}">
-  <ds:schemaRefs>
-    <ds:schemaRef ds:uri="http://schemas.microsoft.com/office/2006/metadata/properties"/>
-    <ds:schemaRef ds:uri="http://schemas.microsoft.com/office/infopath/2007/PartnerControls"/>
-  </ds:schemaRefs>
-</ds:datastoreItem>
-</file>
-
-<file path=customXml/itemProps3.xml><?xml version="1.0" encoding="utf-8"?>
 <ds:datastoreItem xmlns:ds="http://schemas.openxmlformats.org/officeDocument/2006/customXml" ds:itemID="{90673534-9590-47F8-B0D6-46AB217CB3AD}">
   <ds:schemaRefs>
     <ds:schemaRef ds:uri="http://schemas.microsoft.com/office/2006/metadata/contentType"/>
@@ -9976,10 +9484,19 @@
 </ds:datastoreItem>
 </file>
 
+<file path=customXml/itemProps3.xml><?xml version="1.0" encoding="utf-8"?>
+<ds:datastoreItem xmlns:ds="http://schemas.openxmlformats.org/officeDocument/2006/customXml" ds:itemID="{5F1783E3-BA1C-4CA3-8E32-C9B378BBED03}">
+  <ds:schemaRefs>
+    <ds:schemaRef ds:uri="http://schemas.microsoft.com/office/2006/metadata/properties"/>
+    <ds:schemaRef ds:uri="http://schemas.microsoft.com/office/infopath/2007/PartnerControls"/>
+  </ds:schemaRefs>
+</ds:datastoreItem>
+</file>
+
 <file path=customXml/itemProps4.xml><?xml version="1.0" encoding="utf-8"?>
-<ds:datastoreItem xmlns:ds="http://schemas.openxmlformats.org/officeDocument/2006/customXml" ds:itemID="{DABAA964-10BA-4DBC-ABF2-CDEAC0FAF7AA}">
+<ds:datastoreItem xmlns:ds="http://schemas.openxmlformats.org/officeDocument/2006/customXml" ds:itemID="{38798A93-35BB-4E36-97F5-7254B21EAFCC}">
   <ds:schemaRefs>
-    <ds:schemaRef ds:uri="http://schemas.microsoft.com/sharepoint/v3/contenttype/forms"/>
+    <ds:schemaRef ds:uri="http://schemas.openxmlformats.org/officeDocument/2006/bibliography"/>
   </ds:schemaRefs>
 </ds:datastoreItem>
 </file>
</xml_diff>

<commit_message>
docs: ajustes adicionales al diario de reflexion
</commit_message>
<xml_diff>
--- a/docs/fase1/individuales/MUNZENMAYER_REINHARTD_1.2_APT122_DiarioReflexionFase1.docx
+++ b/docs/fase1/individuales/MUNZENMAYER_REINHARTD_1.2_APT122_DiarioReflexionFase1.docx
@@ -380,7 +380,31 @@
                 <w:sz w:val="24"/>
                 <w:szCs w:val="24"/>
               </w:rPr>
-              <w:t>Desde una perspectiva personal; me fueron muy interesantes y entretenidas las asignaturas de: Inteligencia de negocio, así como las relacionadas con Cloud y gestión de datos e información (BigData y Minería de Datos). Uno de los que más me gustaron para mí, fue Base de datos, desde cómo se relacionan y crean, sus tablas, y la lógica en la búsqueda de la información, gestión y manipulación de los datos.</w:t>
+              <w:t>Desde una perspectiva personal; me fueron muy interesantes y entretenidas las asignaturas de: Inteligencia de negocio, así como las relacionadas con Cloud y gestión de datos e información (</w:t>
+            </w:r>
+            <w:proofErr w:type="spellStart"/>
+            <w:r>
+              <w:rPr>
+                <w:rFonts w:eastAsiaTheme="majorEastAsia"/>
+                <w:b/>
+                <w:bCs/>
+                <w:color w:val="767171" w:themeColor="background2" w:themeShade="80"/>
+                <w:sz w:val="24"/>
+                <w:szCs w:val="24"/>
+              </w:rPr>
+              <w:t>BigData</w:t>
+            </w:r>
+            <w:proofErr w:type="spellEnd"/>
+            <w:r>
+              <w:rPr>
+                <w:rFonts w:eastAsiaTheme="majorEastAsia"/>
+                <w:b/>
+                <w:bCs/>
+                <w:color w:val="767171" w:themeColor="background2" w:themeShade="80"/>
+                <w:sz w:val="24"/>
+                <w:szCs w:val="24"/>
+              </w:rPr>
+              <w:t xml:space="preserve"> y Minería de Datos). Uno de los que más me gustaron para mí, fue Base de datos, desde cómo se relacionan y crean, sus tablas, y la lógica en la búsqueda de la información, gestión y manipulación de los datos.</w:t>
             </w:r>
           </w:p>
           <w:p>
@@ -475,7 +499,31 @@
                 <w:sz w:val="24"/>
                 <w:szCs w:val="24"/>
               </w:rPr>
-              <w:t>No me siento seguro ni identificado con las certificaciones obtenidas, como tampoco sabría como darle utilidad real en el mercado.</w:t>
+              <w:t xml:space="preserve">No me siento seguro ni identificado con las certificaciones obtenidas, como tampoco sabría </w:t>
+            </w:r>
+            <w:proofErr w:type="spellStart"/>
+            <w:r>
+              <w:rPr>
+                <w:rFonts w:eastAsiaTheme="majorEastAsia"/>
+                <w:b/>
+                <w:bCs/>
+                <w:color w:val="767171" w:themeColor="background2" w:themeShade="80"/>
+                <w:sz w:val="24"/>
+                <w:szCs w:val="24"/>
+              </w:rPr>
+              <w:t>como</w:t>
+            </w:r>
+            <w:proofErr w:type="spellEnd"/>
+            <w:r>
+              <w:rPr>
+                <w:rFonts w:eastAsiaTheme="majorEastAsia"/>
+                <w:b/>
+                <w:bCs/>
+                <w:color w:val="767171" w:themeColor="background2" w:themeShade="80"/>
+                <w:sz w:val="24"/>
+                <w:szCs w:val="24"/>
+              </w:rPr>
+              <w:t xml:space="preserve"> darle utilidad real en el mercado.</w:t>
             </w:r>
           </w:p>
           <w:p>
@@ -793,11 +841,66 @@
                 <w:rFonts w:eastAsiaTheme="majorEastAsia"/>
                 <w:b/>
                 <w:bCs/>
-                <w:color w:val="767171" w:themeColor="background2" w:themeShade="80"/>
-                <w:sz w:val="24"/>
-                <w:szCs w:val="24"/>
-              </w:rPr>
-              <w:t>Me sentí cómodo en los ramos de gestión y documentación, y complicado, pero a su vez mucho mas interesado, con los ramos relacionados con Base de Datos, en nuestro caso con SQL. No me siento preparado ni confiado en los ramos de Programación, ni preparado en las gestiones enteramente con CLOUD, pero es algo que busco mejorar.</w:t>
+                <w:color w:val="00B050"/>
+                <w:sz w:val="24"/>
+                <w:szCs w:val="24"/>
+              </w:rPr>
+              <w:t xml:space="preserve">Me sentí cómodo en los ramos de gestión y documentación, y complicado, pero a su vez mucho </w:t>
+            </w:r>
+            <w:r>
+              <w:rPr>
+                <w:rFonts w:eastAsiaTheme="majorEastAsia"/>
+                <w:b/>
+                <w:bCs/>
+                <w:color w:val="00B050"/>
+                <w:sz w:val="24"/>
+                <w:szCs w:val="24"/>
+              </w:rPr>
+              <w:t>más</w:t>
+            </w:r>
+            <w:r>
+              <w:rPr>
+                <w:rFonts w:eastAsiaTheme="majorEastAsia"/>
+                <w:b/>
+                <w:bCs/>
+                <w:color w:val="00B050"/>
+                <w:sz w:val="24"/>
+                <w:szCs w:val="24"/>
+              </w:rPr>
+              <w:t xml:space="preserve"> interesado, con los ramos relacionados con Base de Datos, en nuestro caso con SQL.</w:t>
+            </w:r>
+            <w:r>
+              <w:rPr>
+                <w:rFonts w:eastAsiaTheme="majorEastAsia"/>
+                <w:b/>
+                <w:bCs/>
+                <w:color w:val="767171" w:themeColor="background2" w:themeShade="80"/>
+                <w:sz w:val="24"/>
+                <w:szCs w:val="24"/>
+              </w:rPr>
+              <w:t xml:space="preserve"> </w:t>
+            </w:r>
+            <w:r>
+              <w:rPr>
+                <w:rFonts w:eastAsiaTheme="majorEastAsia"/>
+                <w:b/>
+                <w:bCs/>
+                <w:color w:val="EE0000"/>
+                <w:sz w:val="24"/>
+                <w:szCs w:val="24"/>
+              </w:rPr>
+              <w:t>No me siento preparado ni confiado en los ramos de Programación, ni preparado en las gestiones enteramente con CLOUD</w:t>
+            </w:r>
+            <w:r>
+              <w:rPr>
+                <w:rFonts w:eastAsiaTheme="majorEastAsia"/>
+                <w:b/>
+                <w:bCs/>
+                <w:color w:val="767171" w:themeColor="background2" w:themeShade="80"/>
+                <w:sz w:val="24"/>
+                <w:szCs w:val="24"/>
+              </w:rPr>
+              <w:t>, pero es algo que busco mejorar.</w:t>
             </w:r>
           </w:p>
           <w:p>
@@ -1077,6 +1180,7 @@
                 <w:szCs w:val="24"/>
               </w:rPr>
             </w:pPr>
+            <w:proofErr w:type="spellStart"/>
             <w:r>
               <w:rPr>
                 <w:rFonts w:eastAsiaTheme="majorEastAsia"/>
@@ -1086,7 +1190,43 @@
                 <w:sz w:val="24"/>
                 <w:szCs w:val="24"/>
               </w:rPr>
-              <w:t>Prompt, datos, arquitectura cloud, programación Python y manejo de SQL y NoSQL</w:t>
+              <w:t>Prompt</w:t>
+            </w:r>
+            <w:proofErr w:type="spellEnd"/>
+            <w:r>
+              <w:rPr>
+                <w:rFonts w:eastAsiaTheme="majorEastAsia"/>
+                <w:b/>
+                <w:bCs/>
+                <w:color w:val="767171" w:themeColor="background2" w:themeShade="80"/>
+                <w:sz w:val="24"/>
+                <w:szCs w:val="24"/>
+              </w:rPr>
+              <w:t xml:space="preserve">, datos, arquitectura </w:t>
+            </w:r>
+            <w:proofErr w:type="spellStart"/>
+            <w:r>
+              <w:rPr>
+                <w:rFonts w:eastAsiaTheme="majorEastAsia"/>
+                <w:b/>
+                <w:bCs/>
+                <w:color w:val="767171" w:themeColor="background2" w:themeShade="80"/>
+                <w:sz w:val="24"/>
+                <w:szCs w:val="24"/>
+              </w:rPr>
+              <w:t>cloud</w:t>
+            </w:r>
+            <w:proofErr w:type="spellEnd"/>
+            <w:r>
+              <w:rPr>
+                <w:rFonts w:eastAsiaTheme="majorEastAsia"/>
+                <w:b/>
+                <w:bCs/>
+                <w:color w:val="767171" w:themeColor="background2" w:themeShade="80"/>
+                <w:sz w:val="24"/>
+                <w:szCs w:val="24"/>
+              </w:rPr>
+              <w:t>, programación Python y manejo de SQL y NoSQL</w:t>
             </w:r>
             <w:r>
               <w:rPr>
@@ -1138,8 +1278,9 @@
                 <w:sz w:val="24"/>
                 <w:szCs w:val="24"/>
               </w:rPr>
-              <w:t>Programación y cloud primeramente, y en segundo puesto SQL </w:t>
-            </w:r>
+              <w:t xml:space="preserve">Programación y </w:t>
+            </w:r>
+            <w:proofErr w:type="spellStart"/>
             <w:r>
               <w:rPr>
                 <w:rFonts w:eastAsiaTheme="majorEastAsia"/>
@@ -1149,8 +1290,44 @@
                 <w:sz w:val="24"/>
                 <w:szCs w:val="24"/>
               </w:rPr>
+              <w:t>cloud</w:t>
+            </w:r>
+            <w:proofErr w:type="spellEnd"/>
+            <w:r>
+              <w:rPr>
+                <w:rFonts w:eastAsiaTheme="majorEastAsia"/>
+                <w:b/>
+                <w:bCs/>
+                <w:color w:val="767171" w:themeColor="background2" w:themeShade="80"/>
+                <w:sz w:val="24"/>
+                <w:szCs w:val="24"/>
+              </w:rPr>
+              <w:t xml:space="preserve"> primeramente, y en segundo puesto </w:t>
+            </w:r>
+            <w:proofErr w:type="gramStart"/>
+            <w:r>
+              <w:rPr>
+                <w:rFonts w:eastAsiaTheme="majorEastAsia"/>
+                <w:b/>
+                <w:bCs/>
+                <w:color w:val="767171" w:themeColor="background2" w:themeShade="80"/>
+                <w:sz w:val="24"/>
+                <w:szCs w:val="24"/>
+              </w:rPr>
+              <w:t>SQL </w:t>
+            </w:r>
+            <w:r>
+              <w:rPr>
+                <w:rFonts w:eastAsiaTheme="majorEastAsia"/>
+                <w:b/>
+                <w:bCs/>
+                <w:color w:val="767171" w:themeColor="background2" w:themeShade="80"/>
+                <w:sz w:val="24"/>
+                <w:szCs w:val="24"/>
+              </w:rPr>
               <w:t>.</w:t>
             </w:r>
+            <w:proofErr w:type="gramEnd"/>
           </w:p>
           <w:p>
             <w:pPr>
@@ -1273,7 +1450,31 @@
                 <w:sz w:val="24"/>
                 <w:szCs w:val="24"/>
               </w:rPr>
-              <w:t>Trabajando en Cloud, y programando, utilizando IA (skills o agentes) apuntando a la WEB.</w:t>
+              <w:t>Trabajando en Cloud, y programando, utilizando IA (</w:t>
+            </w:r>
+            <w:proofErr w:type="spellStart"/>
+            <w:r>
+              <w:rPr>
+                <w:rFonts w:eastAsiaTheme="majorEastAsia"/>
+                <w:b/>
+                <w:bCs/>
+                <w:color w:val="767171" w:themeColor="background2" w:themeShade="80"/>
+                <w:sz w:val="24"/>
+                <w:szCs w:val="24"/>
+              </w:rPr>
+              <w:t>skills</w:t>
+            </w:r>
+            <w:proofErr w:type="spellEnd"/>
+            <w:r>
+              <w:rPr>
+                <w:rFonts w:eastAsiaTheme="majorEastAsia"/>
+                <w:b/>
+                <w:bCs/>
+                <w:color w:val="767171" w:themeColor="background2" w:themeShade="80"/>
+                <w:sz w:val="24"/>
+                <w:szCs w:val="24"/>
+              </w:rPr>
+              <w:t xml:space="preserve"> o agentes) apuntando a la WEB.</w:t>
             </w:r>
           </w:p>
           <w:p>
@@ -1645,7 +1846,27 @@
                 <w:sz w:val="24"/>
                 <w:szCs w:val="24"/>
               </w:rPr>
-              <w:t>Integración y trabajar con APIs, IA y Cloud</w:t>
+              <w:t xml:space="preserve">Integración y trabajar con </w:t>
+            </w:r>
+            <w:proofErr w:type="spellStart"/>
+            <w:r>
+              <w:rPr>
+                <w:rFonts w:eastAsiaTheme="majorEastAsia"/>
+                <w:color w:val="767171" w:themeColor="background2" w:themeShade="80"/>
+                <w:sz w:val="24"/>
+                <w:szCs w:val="24"/>
+              </w:rPr>
+              <w:t>APIs</w:t>
+            </w:r>
+            <w:proofErr w:type="spellEnd"/>
+            <w:r>
+              <w:rPr>
+                <w:rFonts w:eastAsiaTheme="majorEastAsia"/>
+                <w:color w:val="767171" w:themeColor="background2" w:themeShade="80"/>
+                <w:sz w:val="24"/>
+                <w:szCs w:val="24"/>
+              </w:rPr>
+              <w:t>, IA y Cloud</w:t>
             </w:r>
           </w:p>
           <w:p>
@@ -1824,6 +2045,15 @@
                 <w:sz w:val="24"/>
                 <w:szCs w:val="24"/>
               </w:rPr>
+              <w:t>a</w:t>
+            </w:r>
+            <w:r>
+              <w:rPr>
+                <w:rFonts w:eastAsiaTheme="majorEastAsia"/>
+                <w:color w:val="767171" w:themeColor="background2" w:themeShade="80"/>
+                <w:sz w:val="24"/>
+                <w:szCs w:val="24"/>
+              </w:rPr>
               <w:t xml:space="preserve">punta </w:t>
             </w:r>
             <w:r>
@@ -1833,7 +2063,34 @@
                 <w:sz w:val="24"/>
                 <w:szCs w:val="24"/>
               </w:rPr>
-              <w:t xml:space="preserve">hacia un sistema de cobro multi-pasarela (integración con Webpay y otros proveedores), en articulación con la empresa Dtemite. </w:t>
+              <w:t xml:space="preserve">hacia un sistema de cobro multi-pasarela (integración con Webpay y otros proveedores), </w:t>
+            </w:r>
+            <w:r>
+              <w:rPr>
+                <w:rFonts w:eastAsiaTheme="majorEastAsia"/>
+                <w:color w:val="767171" w:themeColor="background2" w:themeShade="80"/>
+                <w:sz w:val="24"/>
+                <w:szCs w:val="24"/>
+              </w:rPr>
+              <w:t>en</w:t>
+            </w:r>
+            <w:r>
+              <w:rPr>
+                <w:rFonts w:eastAsiaTheme="majorEastAsia"/>
+                <w:color w:val="767171" w:themeColor="background2" w:themeShade="80"/>
+                <w:sz w:val="24"/>
+                <w:szCs w:val="24"/>
+              </w:rPr>
+              <w:t xml:space="preserve"> conjunto </w:t>
+            </w:r>
+            <w:r>
+              <w:rPr>
+                <w:rFonts w:eastAsiaTheme="majorEastAsia"/>
+                <w:color w:val="767171" w:themeColor="background2" w:themeShade="80"/>
+                <w:sz w:val="24"/>
+                <w:szCs w:val="24"/>
+              </w:rPr>
+              <w:t xml:space="preserve">con la empresa Dtemite. </w:t>
             </w:r>
           </w:p>
           <w:p>
@@ -1872,27 +2129,90 @@
                 <w:sz w:val="24"/>
                 <w:szCs w:val="24"/>
               </w:rPr>
-              <w:t xml:space="preserve">Aunque no es un proyecto de IA como planteaba inicialmente, sí conecta con la integración de sistemas, </w:t>
-            </w:r>
-            <w:r>
-              <w:rPr>
-                <w:rFonts w:eastAsiaTheme="majorEastAsia"/>
-                <w:b/>
-                <w:bCs/>
-                <w:color w:val="767171" w:themeColor="background2" w:themeShade="80"/>
-                <w:sz w:val="24"/>
-                <w:szCs w:val="24"/>
-              </w:rPr>
-              <w:t>arquitectura de datos</w:t>
-            </w:r>
-            <w:r>
-              <w:rPr>
-                <w:rFonts w:eastAsiaTheme="majorEastAsia"/>
-                <w:color w:val="767171" w:themeColor="background2" w:themeShade="80"/>
-                <w:sz w:val="24"/>
-                <w:szCs w:val="24"/>
-              </w:rPr>
-              <w:t xml:space="preserve"> y trabajo con APIs externas, y aplicar gestión de proyectos y control de versiones</w:t>
+              <w:t>Aunque no es un proyecto de IA, sí conecta con la integración de sistemas</w:t>
+            </w:r>
+            <w:r>
+              <w:rPr>
+                <w:rFonts w:eastAsiaTheme="majorEastAsia"/>
+                <w:color w:val="767171" w:themeColor="background2" w:themeShade="80"/>
+                <w:sz w:val="24"/>
+                <w:szCs w:val="24"/>
+              </w:rPr>
+              <w:t>, arquitectura de datos</w:t>
+            </w:r>
+            <w:r>
+              <w:rPr>
+                <w:rFonts w:eastAsiaTheme="majorEastAsia"/>
+                <w:color w:val="767171" w:themeColor="background2" w:themeShade="80"/>
+                <w:sz w:val="24"/>
+                <w:szCs w:val="24"/>
+              </w:rPr>
+              <w:t xml:space="preserve"> y trabajo con </w:t>
+            </w:r>
+            <w:proofErr w:type="spellStart"/>
+            <w:r>
+              <w:rPr>
+                <w:rFonts w:eastAsiaTheme="majorEastAsia"/>
+                <w:color w:val="767171" w:themeColor="background2" w:themeShade="80"/>
+                <w:sz w:val="24"/>
+                <w:szCs w:val="24"/>
+              </w:rPr>
+              <w:t>APIs</w:t>
+            </w:r>
+            <w:proofErr w:type="spellEnd"/>
+            <w:r>
+              <w:rPr>
+                <w:rFonts w:eastAsiaTheme="majorEastAsia"/>
+                <w:color w:val="767171" w:themeColor="background2" w:themeShade="80"/>
+                <w:sz w:val="24"/>
+                <w:szCs w:val="24"/>
+              </w:rPr>
+              <w:t xml:space="preserve"> </w:t>
+            </w:r>
+            <w:r>
+              <w:rPr>
+                <w:rFonts w:eastAsiaTheme="majorEastAsia"/>
+                <w:color w:val="767171" w:themeColor="background2" w:themeShade="80"/>
+                <w:sz w:val="24"/>
+                <w:szCs w:val="24"/>
+              </w:rPr>
+              <w:t>externas,</w:t>
+            </w:r>
+            <w:r>
+              <w:rPr>
+                <w:rFonts w:eastAsiaTheme="majorEastAsia"/>
+                <w:color w:val="767171" w:themeColor="background2" w:themeShade="80"/>
+                <w:sz w:val="24"/>
+                <w:szCs w:val="24"/>
+              </w:rPr>
+              <w:t xml:space="preserve"> también permite</w:t>
+            </w:r>
+            <w:r>
+              <w:rPr>
+                <w:rFonts w:eastAsiaTheme="majorEastAsia"/>
+                <w:color w:val="767171" w:themeColor="background2" w:themeShade="80"/>
+                <w:sz w:val="24"/>
+                <w:szCs w:val="24"/>
+              </w:rPr>
+              <w:t xml:space="preserve"> aplicar </w:t>
+            </w:r>
+            <w:r>
+              <w:rPr>
+                <w:rFonts w:eastAsiaTheme="majorEastAsia"/>
+                <w:color w:val="767171" w:themeColor="background2" w:themeShade="80"/>
+                <w:sz w:val="24"/>
+                <w:szCs w:val="24"/>
+              </w:rPr>
+              <w:t xml:space="preserve">la </w:t>
+            </w:r>
+            <w:r>
+              <w:rPr>
+                <w:rFonts w:eastAsiaTheme="majorEastAsia"/>
+                <w:color w:val="767171" w:themeColor="background2" w:themeShade="80"/>
+                <w:sz w:val="24"/>
+                <w:szCs w:val="24"/>
+              </w:rPr>
+              <w:t>gestión de proyectos y control de versiones</w:t>
             </w:r>
             <w:r>
               <w:rPr>
@@ -8060,6 +8380,7 @@
   <w:style w:type="character" w:default="1" w:styleId="Fuentedeprrafopredeter">
     <w:name w:val="Default Paragraph Font"/>
     <w:uiPriority w:val="1"/>
+    <w:semiHidden/>
     <w:unhideWhenUsed/>
   </w:style>
   <w:style w:type="table" w:default="1" w:styleId="Tablanormal">
@@ -9308,15 +9629,16 @@
 </file>
 
 <file path=customXml/item1.xml><?xml version="1.0" encoding="utf-8"?>
-<?mso-contentType ?>
-<FormTemplates xmlns="http://schemas.microsoft.com/sharepoint/v3/contenttype/forms">
-  <Display>DocumentLibraryForm</Display>
-  <Edit>DocumentLibraryForm</Edit>
-  <New>DocumentLibraryForm</New>
-</FormTemplates>
+<b:Sources xmlns:b="http://schemas.openxmlformats.org/officeDocument/2006/bibliography" xmlns="http://schemas.openxmlformats.org/officeDocument/2006/bibliography" SelectedStyle="\APASixthEditionOfficeOnline.xsl" StyleName="APA" Version="6"/>
 </file>
 
 <file path=customXml/item2.xml><?xml version="1.0" encoding="utf-8"?>
+<p:properties xmlns:p="http://schemas.microsoft.com/office/2006/metadata/properties" xmlns:xsi="http://www.w3.org/2001/XMLSchema-instance" xmlns:pc="http://schemas.microsoft.com/office/infopath/2007/PartnerControls">
+  <documentManagement/>
+</p:properties>
+</file>
+
+<file path=customXml/item3.xml><?xml version="1.0" encoding="utf-8"?>
 <ct:contentTypeSchema xmlns:ct="http://schemas.microsoft.com/office/2006/metadata/contentType" xmlns:ma="http://schemas.microsoft.com/office/2006/metadata/properties/metaAttributes" ct:_="" ma:_="" ma:contentTypeName="Documento" ma:contentTypeID="0x010100E96778489EE7714D8BD12CC105EB918B" ma:contentTypeVersion="2" ma:contentTypeDescription="Crear nuevo documento." ma:contentTypeScope="" ma:versionID="416c5c7ae9b5d54d83875cd3c65194e3">
   <xsd:schema xmlns:xsd="http://www.w3.org/2001/XMLSchema" xmlns:xs="http://www.w3.org/2001/XMLSchema" xmlns:p="http://schemas.microsoft.com/office/2006/metadata/properties" xmlns:ns2="126e8a1c-9ea9-435a-ac89-d06c80d62e30" targetNamespace="http://schemas.microsoft.com/office/2006/metadata/properties" ma:root="true" ma:fieldsID="70a237c842677bd850644f8595079f5e" ns2:_="">
     <xsd:import namespace="126e8a1c-9ea9-435a-ac89-d06c80d62e30"/>
@@ -9448,25 +9770,33 @@
 </ct:contentTypeSchema>
 </file>
 
-<file path=customXml/item3.xml><?xml version="1.0" encoding="utf-8"?>
-<p:properties xmlns:p="http://schemas.microsoft.com/office/2006/metadata/properties" xmlns:xsi="http://www.w3.org/2001/XMLSchema-instance" xmlns:pc="http://schemas.microsoft.com/office/infopath/2007/PartnerControls">
-  <documentManagement/>
-</p:properties>
-</file>
-
 <file path=customXml/item4.xml><?xml version="1.0" encoding="utf-8"?>
-<b:Sources xmlns:b="http://schemas.openxmlformats.org/officeDocument/2006/bibliography" xmlns="http://schemas.openxmlformats.org/officeDocument/2006/bibliography" SelectedStyle="\APASixthEditionOfficeOnline.xsl" StyleName="APA" Version="6"/>
+<?mso-contentType ?>
+<FormTemplates xmlns="http://schemas.microsoft.com/sharepoint/v3/contenttype/forms">
+  <Display>DocumentLibraryForm</Display>
+  <Edit>DocumentLibraryForm</Edit>
+  <New>DocumentLibraryForm</New>
+</FormTemplates>
 </file>
 
 <file path=customXml/itemProps1.xml><?xml version="1.0" encoding="utf-8"?>
-<ds:datastoreItem xmlns:ds="http://schemas.openxmlformats.org/officeDocument/2006/customXml" ds:itemID="{DABAA964-10BA-4DBC-ABF2-CDEAC0FAF7AA}">
+<ds:datastoreItem xmlns:ds="http://schemas.openxmlformats.org/officeDocument/2006/customXml" ds:itemID="{38798A93-35BB-4E36-97F5-7254B21EAFCC}">
   <ds:schemaRefs>
-    <ds:schemaRef ds:uri="http://schemas.microsoft.com/sharepoint/v3/contenttype/forms"/>
+    <ds:schemaRef ds:uri="http://schemas.openxmlformats.org/officeDocument/2006/bibliography"/>
   </ds:schemaRefs>
 </ds:datastoreItem>
 </file>
 
 <file path=customXml/itemProps2.xml><?xml version="1.0" encoding="utf-8"?>
+<ds:datastoreItem xmlns:ds="http://schemas.openxmlformats.org/officeDocument/2006/customXml" ds:itemID="{5F1783E3-BA1C-4CA3-8E32-C9B378BBED03}">
+  <ds:schemaRefs>
+    <ds:schemaRef ds:uri="http://schemas.microsoft.com/office/2006/metadata/properties"/>
+    <ds:schemaRef ds:uri="http://schemas.microsoft.com/office/infopath/2007/PartnerControls"/>
+  </ds:schemaRefs>
+</ds:datastoreItem>
+</file>
+
+<file path=customXml/itemProps3.xml><?xml version="1.0" encoding="utf-8"?>
 <ds:datastoreItem xmlns:ds="http://schemas.openxmlformats.org/officeDocument/2006/customXml" ds:itemID="{90673534-9590-47F8-B0D6-46AB217CB3AD}">
   <ds:schemaRefs>
     <ds:schemaRef ds:uri="http://schemas.microsoft.com/office/2006/metadata/contentType"/>
@@ -9484,19 +9814,10 @@
 </ds:datastoreItem>
 </file>
 
-<file path=customXml/itemProps3.xml><?xml version="1.0" encoding="utf-8"?>
-<ds:datastoreItem xmlns:ds="http://schemas.openxmlformats.org/officeDocument/2006/customXml" ds:itemID="{5F1783E3-BA1C-4CA3-8E32-C9B378BBED03}">
+<file path=customXml/itemProps4.xml><?xml version="1.0" encoding="utf-8"?>
+<ds:datastoreItem xmlns:ds="http://schemas.openxmlformats.org/officeDocument/2006/customXml" ds:itemID="{DABAA964-10BA-4DBC-ABF2-CDEAC0FAF7AA}">
   <ds:schemaRefs>
-    <ds:schemaRef ds:uri="http://schemas.microsoft.com/office/2006/metadata/properties"/>
-    <ds:schemaRef ds:uri="http://schemas.microsoft.com/office/infopath/2007/PartnerControls"/>
-  </ds:schemaRefs>
-</ds:datastoreItem>
-</file>
-
-<file path=customXml/itemProps4.xml><?xml version="1.0" encoding="utf-8"?>
-<ds:datastoreItem xmlns:ds="http://schemas.openxmlformats.org/officeDocument/2006/customXml" ds:itemID="{38798A93-35BB-4E36-97F5-7254B21EAFCC}">
-  <ds:schemaRefs>
-    <ds:schemaRef ds:uri="http://schemas.openxmlformats.org/officeDocument/2006/bibliography"/>
+    <ds:schemaRef ds:uri="http://schemas.microsoft.com/sharepoint/v3/contenttype/forms"/>
   </ds:schemaRefs>
 </ds:datastoreItem>
 </file>
</xml_diff>